<commit_message>
fix: el texto de los pagares incluia centavos rompiendo la lectura
</commit_message>
<xml_diff>
--- a/server-flask/src/infrastructure/documents/templates/pagare_template.docx
+++ b/server-flask/src/infrastructure/documents/templates/pagare_template.docx
@@ -1,6 +1,6 @@
 
 <file path=word/document.xml><?xml version="1.0" encoding="utf-8"?>
-<w:document xmlns:wpc="http://schemas.microsoft.com/office/word/2010/wordprocessingCanvas" xmlns:cx="http://schemas.microsoft.com/office/drawing/2014/chartex" xmlns:cx1="http://schemas.microsoft.com/office/drawing/2015/9/8/chartex" xmlns:cx2="http://schemas.microsoft.com/office/drawing/2015/10/21/chartex" xmlns:cx3="http://schemas.microsoft.com/office/drawing/2016/5/9/chartex" xmlns:cx4="http://schemas.microsoft.com/office/drawing/2016/5/10/chartex" xmlns:cx5="http://schemas.microsoft.com/office/drawing/2016/5/11/chartex" xmlns:cx6="http://schemas.microsoft.com/office/drawing/2016/5/12/chartex" xmlns:cx7="http://schemas.microsoft.com/office/drawing/2016/5/13/chartex" xmlns:cx8="http://schemas.microsoft.com/office/drawing/2016/5/14/chartex" xmlns:mc="http://schemas.openxmlformats.org/markup-compatibility/2006" xmlns:aink="http://schemas.microsoft.com/office/drawing/2016/ink" xmlns:am3d="http://schemas.microsoft.com/office/drawing/2017/model3d" xmlns:o="urn:schemas-microsoft-com:office:office" xmlns:oel="http://schemas.microsoft.com/office/2019/extlst" xmlns:r="http://schemas.openxmlformats.org/officeDocument/2006/relationships" xmlns:m="http://schemas.openxmlformats.org/officeDocument/2006/math" xmlns:v="urn:schemas-microsoft-com:vml" xmlns:wp14="http://schemas.microsoft.com/office/word/2010/wordprocessingDrawing" xmlns:wp="http://schemas.openxmlformats.org/drawingml/2006/wordprocessingDrawing" xmlns:w10="urn:schemas-microsoft-com:office:word" xmlns:w="http://schemas.openxmlformats.org/wordprocessingml/2006/main" xmlns:w14="http://schemas.microsoft.com/office/word/2010/wordml" xmlns:w15="http://schemas.microsoft.com/office/word/2012/wordml" xmlns:w16cex="http://schemas.microsoft.com/office/word/2018/wordml/cex" xmlns:w16cid="http://schemas.microsoft.com/office/word/2016/wordml/cid" xmlns:w16="http://schemas.microsoft.com/office/word/2018/wordml" xmlns:w16du="http://schemas.microsoft.com/office/word/2023/wordml/word16du" xmlns:w16sdtdh="http://schemas.microsoft.com/office/word/2020/wordml/sdtdatahash" xmlns:w16sdtfl="http://schemas.microsoft.com/office/word/2024/wordml/sdtformatlock" xmlns:w16se="http://schemas.microsoft.com/office/word/2015/wordml/symex" xmlns:wpg="http://schemas.microsoft.com/office/word/2010/wordprocessingGroup" xmlns:wpi="http://schemas.microsoft.com/office/word/2010/wordprocessingInk" xmlns:wne="http://schemas.microsoft.com/office/word/2006/wordml" xmlns:wps="http://schemas.microsoft.com/office/word/2010/wordprocessingShape" mc:Ignorable="w14 w15 w16se w16cid w16 w16cex w16sdtdh w16sdtfl w16du wp14">
+<w:document xmlns:wpc="http://schemas.microsoft.com/office/word/2010/wordprocessingCanvas" xmlns:cx="http://schemas.microsoft.com/office/drawing/2014/chartex" xmlns:cx1="http://schemas.microsoft.com/office/drawing/2015/9/8/chartex" xmlns:mc="http://schemas.openxmlformats.org/markup-compatibility/2006" xmlns:o="urn:schemas-microsoft-com:office:office" xmlns:r="http://schemas.openxmlformats.org/officeDocument/2006/relationships" xmlns:m="http://schemas.openxmlformats.org/officeDocument/2006/math" xmlns:v="urn:schemas-microsoft-com:vml" xmlns:wp14="http://schemas.microsoft.com/office/word/2010/wordprocessingDrawing" xmlns:wp="http://schemas.openxmlformats.org/drawingml/2006/wordprocessingDrawing" xmlns:w10="urn:schemas-microsoft-com:office:word" xmlns:w="http://schemas.openxmlformats.org/wordprocessingml/2006/main" xmlns:w14="http://schemas.microsoft.com/office/word/2010/wordml" xmlns:w15="http://schemas.microsoft.com/office/word/2012/wordml" xmlns:w16se="http://schemas.microsoft.com/office/word/2015/wordml/symex" xmlns:wpg="http://schemas.microsoft.com/office/word/2010/wordprocessingGroup" xmlns:wpi="http://schemas.microsoft.com/office/word/2010/wordprocessingInk" xmlns:wne="http://schemas.microsoft.com/office/word/2006/wordml" xmlns:wps="http://schemas.microsoft.com/office/word/2010/wordprocessingShape" mc:Ignorable="w14 w15 w16se wp14">
   <w:body>
     <w:p>
       <w:pPr>
@@ -102,6 +102,7 @@
               </w:rPr>
               <w:t>{{</w:t>
             </w:r>
+            <w:proofErr w:type="spellStart"/>
             <w:r>
               <w:rPr>
                 <w:rFonts w:ascii="Times New Roman" w:hAnsi="Times New Roman"/>
@@ -109,6 +110,7 @@
               </w:rPr>
               <w:t>full_name</w:t>
             </w:r>
+            <w:proofErr w:type="spellEnd"/>
             <w:r>
               <w:rPr>
                 <w:rFonts w:ascii="Times New Roman" w:hAnsi="Times New Roman"/>
@@ -177,12 +179,14 @@
               </w:rPr>
               <w:t>{{</w:t>
             </w:r>
+            <w:proofErr w:type="spellStart"/>
             <w:r>
               <w:rPr>
                 <w:rFonts w:ascii="Garamond" w:eastAsia="Garamond" w:hAnsi="Garamond" w:cs="Garamond"/>
               </w:rPr>
               <w:t>actual_date_header</w:t>
             </w:r>
+            <w:proofErr w:type="spellEnd"/>
             <w:r>
               <w:rPr>
                 <w:rFonts w:ascii="Garamond" w:eastAsia="Garamond" w:hAnsi="Garamond" w:cs="Garamond"/>
@@ -323,6 +327,7 @@
               </w:rPr>
               <w:t>{{</w:t>
             </w:r>
+            <w:proofErr w:type="spellStart"/>
             <w:r>
               <w:rPr>
                 <w:rFonts w:ascii="Garamond" w:eastAsia="Garamond" w:hAnsi="Garamond" w:cs="Garamond"/>
@@ -330,6 +335,7 @@
               </w:rPr>
               <w:t>city</w:t>
             </w:r>
+            <w:proofErr w:type="spellEnd"/>
             <w:r>
               <w:rPr>
                 <w:rFonts w:ascii="Garamond" w:eastAsia="Garamond" w:hAnsi="Garamond" w:cs="Garamond"/>
@@ -435,24 +441,28 @@
               </w:rPr>
               <w:t>USD$ {{</w:t>
             </w:r>
+            <w:proofErr w:type="spellStart"/>
             <w:r>
               <w:rPr>
                 <w:rFonts w:ascii="Garamond" w:hAnsi="Garamond" w:cs="Calibri"/>
               </w:rPr>
               <w:t>numerical_amount</w:t>
             </w:r>
+            <w:proofErr w:type="spellEnd"/>
             <w:r>
               <w:rPr>
                 <w:rFonts w:ascii="Garamond" w:hAnsi="Garamond" w:cs="Calibri"/>
               </w:rPr>
               <w:t>}} ({{</w:t>
             </w:r>
+            <w:proofErr w:type="spellStart"/>
             <w:r>
               <w:rPr>
                 <w:rFonts w:ascii="Garamond" w:hAnsi="Garamond" w:cs="Calibri"/>
               </w:rPr>
               <w:t>text_amount</w:t>
             </w:r>
+            <w:proofErr w:type="spellEnd"/>
             <w:r>
               <w:rPr>
                 <w:rFonts w:ascii="Garamond" w:hAnsi="Garamond" w:cs="Calibri"/>
@@ -463,7 +473,13 @@
               <w:rPr>
                 <w:rFonts w:ascii="Garamond" w:hAnsi="Garamond" w:cs="Calibri"/>
               </w:rPr>
-              <w:t xml:space="preserve"> DÓLARES DE LOS ESTADO</w:t>
+              <w:t xml:space="preserve"> </w:t>
+            </w:r>
+            <w:r>
+              <w:rPr>
+                <w:rFonts w:ascii="Garamond" w:hAnsi="Garamond" w:cs="Calibri"/>
+              </w:rPr>
+              <w:t>DE LOS ESTADO</w:t>
             </w:r>
             <w:r>
               <w:rPr>
@@ -820,6 +836,7 @@
         </w:rPr>
         <w:t>{{</w:t>
       </w:r>
+      <w:proofErr w:type="spellStart"/>
       <w:r>
         <w:rPr>
           <w:rFonts w:ascii="Garamond" w:eastAsia="Garamond" w:hAnsi="Garamond" w:cs="Garamond"/>
@@ -828,6 +845,7 @@
         </w:rPr>
         <w:t>city</w:t>
       </w:r>
+      <w:proofErr w:type="spellEnd"/>
       <w:r>
         <w:rPr>
           <w:rFonts w:ascii="Garamond" w:eastAsia="Garamond" w:hAnsi="Garamond" w:cs="Garamond"/>
@@ -870,6 +888,7 @@
         </w:rPr>
         <w:t>{{</w:t>
       </w:r>
+      <w:proofErr w:type="spellStart"/>
       <w:r>
         <w:rPr>
           <w:rFonts w:ascii="Garamond" w:eastAsia="Garamond" w:hAnsi="Garamond" w:cs="Garamond"/>
@@ -880,6 +899,7 @@
         </w:rPr>
         <w:t>national_id</w:t>
       </w:r>
+      <w:proofErr w:type="spellEnd"/>
       <w:r>
         <w:rPr>
           <w:rFonts w:ascii="Garamond" w:eastAsia="Garamond" w:hAnsi="Garamond" w:cs="Garamond"/>
@@ -1020,6 +1040,7 @@
         </w:rPr>
         <w:t>{{</w:t>
       </w:r>
+      <w:proofErr w:type="spellStart"/>
       <w:r>
         <w:rPr>
           <w:rFonts w:ascii="Garamond" w:eastAsia="Garamond" w:hAnsi="Garamond" w:cs="Garamond"/>
@@ -1030,6 +1051,7 @@
         </w:rPr>
         <w:t>numerical_amount</w:t>
       </w:r>
+      <w:proofErr w:type="spellEnd"/>
       <w:r>
         <w:rPr>
           <w:rFonts w:ascii="Garamond" w:eastAsia="Garamond" w:hAnsi="Garamond" w:cs="Garamond"/>
@@ -1068,6 +1090,7 @@
         </w:rPr>
         <w:t>{{</w:t>
       </w:r>
+      <w:proofErr w:type="spellStart"/>
       <w:r>
         <w:rPr>
           <w:rFonts w:ascii="Garamond" w:eastAsia="Garamond" w:hAnsi="Garamond" w:cs="Garamond"/>
@@ -1078,6 +1101,7 @@
         </w:rPr>
         <w:t>text_amount</w:t>
       </w:r>
+      <w:proofErr w:type="spellEnd"/>
       <w:r>
         <w:rPr>
           <w:rFonts w:ascii="Garamond" w:eastAsia="Garamond" w:hAnsi="Garamond" w:cs="Garamond"/>
@@ -1098,16 +1122,8 @@
         </w:rPr>
         <w:t xml:space="preserve"> </w:t>
       </w:r>
-      <w:r>
-        <w:rPr>
-          <w:rFonts w:ascii="Garamond" w:eastAsia="Garamond" w:hAnsi="Garamond" w:cs="Garamond"/>
-          <w:b/>
-          <w:bCs/>
-          <w:sz w:val="24"/>
-          <w:szCs w:val="24"/>
-        </w:rPr>
-        <w:t xml:space="preserve">DÓLARES </w:t>
-      </w:r>
+      <w:bookmarkStart w:id="0" w:name="_GoBack"/>
+      <w:bookmarkEnd w:id="0"/>
       <w:r>
         <w:rPr>
           <w:rFonts w:ascii="Garamond" w:eastAsia="Garamond" w:hAnsi="Garamond" w:cs="Garamond"/>
@@ -1484,6 +1500,7 @@
         </w:rPr>
         <w:t>{{</w:t>
       </w:r>
+      <w:proofErr w:type="spellStart"/>
       <w:r>
         <w:rPr>
           <w:rFonts w:ascii="Garamond" w:eastAsia="Garamond" w:hAnsi="Garamond" w:cs="Garamond"/>
@@ -1492,6 +1509,7 @@
         </w:rPr>
         <w:t>city</w:t>
       </w:r>
+      <w:proofErr w:type="spellEnd"/>
       <w:r>
         <w:rPr>
           <w:rFonts w:ascii="Garamond" w:eastAsia="Garamond" w:hAnsi="Garamond" w:cs="Garamond"/>
@@ -1538,6 +1556,7 @@
         </w:rPr>
         <w:t xml:space="preserve"> {{</w:t>
       </w:r>
+      <w:proofErr w:type="spellStart"/>
       <w:r>
         <w:rPr>
           <w:rFonts w:ascii="Garamond" w:eastAsia="Garamond" w:hAnsi="Garamond" w:cs="Garamond"/>
@@ -1546,6 +1565,7 @@
         </w:rPr>
         <w:t>actual_date</w:t>
       </w:r>
+      <w:proofErr w:type="spellEnd"/>
       <w:r>
         <w:rPr>
           <w:rFonts w:ascii="Garamond" w:eastAsia="Garamond" w:hAnsi="Garamond" w:cs="Garamond"/>
@@ -1768,12 +1788,14 @@
         </w:rPr>
         <w:t>{{</w:t>
       </w:r>
+      <w:proofErr w:type="spellStart"/>
       <w:r>
         <w:rPr>
           <w:rFonts w:ascii="Times New Roman" w:hAnsi="Times New Roman"/>
         </w:rPr>
         <w:t>full_name</w:t>
       </w:r>
+      <w:proofErr w:type="spellEnd"/>
       <w:r>
         <w:rPr>
           <w:rFonts w:ascii="Times New Roman" w:hAnsi="Times New Roman"/>
@@ -1851,6 +1873,7 @@
         </w:rPr>
         <w:t>{{</w:t>
       </w:r>
+      <w:proofErr w:type="spellStart"/>
       <w:r>
         <w:rPr>
           <w:rFonts w:ascii="Garamond" w:eastAsia="Garamond" w:hAnsi="Garamond" w:cs="Garamond"/>
@@ -1859,6 +1882,7 @@
         </w:rPr>
         <w:t>national_id</w:t>
       </w:r>
+      <w:proofErr w:type="spellEnd"/>
       <w:r>
         <w:rPr>
           <w:rFonts w:ascii="Garamond" w:eastAsia="Garamond" w:hAnsi="Garamond" w:cs="Garamond"/>
@@ -1981,6 +2005,7 @@
         </w:rPr>
         <w:t>{{</w:t>
       </w:r>
+      <w:proofErr w:type="spellStart"/>
       <w:r>
         <w:rPr>
           <w:rFonts w:ascii="Garamond" w:eastAsia="Garamond" w:hAnsi="Garamond" w:cs="Garamond"/>
@@ -1991,6 +2016,7 @@
         </w:rPr>
         <w:t>actual_date</w:t>
       </w:r>
+      <w:proofErr w:type="spellEnd"/>
       <w:r>
         <w:rPr>
           <w:rFonts w:ascii="Garamond" w:eastAsia="Garamond" w:hAnsi="Garamond" w:cs="Garamond"/>
@@ -2128,13 +2154,21 @@
           <w:rFonts w:ascii="Garamond" w:hAnsi="Garamond" w:cs="Arial"/>
           <w:lang w:eastAsia="en-US"/>
         </w:rPr>
-        <w:t xml:space="preserve">Representado por: </w:t>
-      </w:r>
+        <w:t>Representado por</w:t>
+      </w:r>
+      <w:proofErr w:type="gramStart"/>
       <w:r>
         <w:rPr>
           <w:rFonts w:ascii="Garamond" w:hAnsi="Garamond" w:cs="Arial"/>
           <w:lang w:eastAsia="en-US"/>
         </w:rPr>
+        <w:t xml:space="preserve">: </w:t>
+      </w:r>
+      <w:r>
+        <w:rPr>
+          <w:rFonts w:ascii="Garamond" w:hAnsi="Garamond" w:cs="Arial"/>
+          <w:lang w:eastAsia="en-US"/>
+        </w:rPr>
         <w:t xml:space="preserve"> </w:t>
       </w:r>
       <w:r>
@@ -2143,7 +2177,34 @@
           <w:b/>
           <w:bCs/>
         </w:rPr>
-        <w:t>{{legal_representative_name}}</w:t>
+        <w:t>{</w:t>
+      </w:r>
+      <w:proofErr w:type="gramEnd"/>
+      <w:r>
+        <w:rPr>
+          <w:rFonts w:ascii="Garamond" w:hAnsi="Garamond"/>
+          <w:b/>
+          <w:bCs/>
+        </w:rPr>
+        <w:t>{</w:t>
+      </w:r>
+      <w:proofErr w:type="spellStart"/>
+      <w:r>
+        <w:rPr>
+          <w:rFonts w:ascii="Garamond" w:hAnsi="Garamond"/>
+          <w:b/>
+          <w:bCs/>
+        </w:rPr>
+        <w:t>legal_representative_name</w:t>
+      </w:r>
+      <w:proofErr w:type="spellEnd"/>
+      <w:r>
+        <w:rPr>
+          <w:rFonts w:ascii="Garamond" w:hAnsi="Garamond"/>
+          <w:b/>
+          <w:bCs/>
+        </w:rPr>
+        <w:t>}}</w:t>
       </w:r>
       <w:r>
         <w:rPr>
@@ -2178,7 +2239,27 @@
           <w:bCs/>
           <w:lang w:val="en-US"/>
         </w:rPr>
-        <w:t>{{legal_representative_id}}</w:t>
+        <w:t>{{</w:t>
+      </w:r>
+      <w:proofErr w:type="spellStart"/>
+      <w:r>
+        <w:rPr>
+          <w:rFonts w:ascii="Garamond" w:hAnsi="Garamond"/>
+          <w:b/>
+          <w:bCs/>
+          <w:lang w:val="en-US"/>
+        </w:rPr>
+        <w:t>legal_representative_id</w:t>
+      </w:r>
+      <w:proofErr w:type="spellEnd"/>
+      <w:r>
+        <w:rPr>
+          <w:rFonts w:ascii="Garamond" w:hAnsi="Garamond"/>
+          <w:b/>
+          <w:bCs/>
+          <w:lang w:val="en-US"/>
+        </w:rPr>
+        <w:t>}}</w:t>
       </w:r>
       <w:r>
         <w:rPr>
@@ -2212,7 +2293,7 @@
 </file>
 
 <file path=word/styles.xml><?xml version="1.0" encoding="utf-8"?>
-<w:styles xmlns:mc="http://schemas.openxmlformats.org/markup-compatibility/2006" xmlns:r="http://schemas.openxmlformats.org/officeDocument/2006/relationships" xmlns:w="http://schemas.openxmlformats.org/wordprocessingml/2006/main" xmlns:w14="http://schemas.microsoft.com/office/word/2010/wordml" xmlns:w15="http://schemas.microsoft.com/office/word/2012/wordml" xmlns:w16cex="http://schemas.microsoft.com/office/word/2018/wordml/cex" xmlns:w16cid="http://schemas.microsoft.com/office/word/2016/wordml/cid" xmlns:w16="http://schemas.microsoft.com/office/word/2018/wordml" xmlns:w16du="http://schemas.microsoft.com/office/word/2023/wordml/word16du" xmlns:w16sdtdh="http://schemas.microsoft.com/office/word/2020/wordml/sdtdatahash" xmlns:w16sdtfl="http://schemas.microsoft.com/office/word/2024/wordml/sdtformatlock" xmlns:w16se="http://schemas.microsoft.com/office/word/2015/wordml/symex" mc:Ignorable="w14 w15 w16se w16cid w16 w16cex w16sdtdh w16sdtfl w16du">
+<w:styles xmlns:mc="http://schemas.openxmlformats.org/markup-compatibility/2006" xmlns:r="http://schemas.openxmlformats.org/officeDocument/2006/relationships" xmlns:w="http://schemas.openxmlformats.org/wordprocessingml/2006/main" xmlns:w14="http://schemas.microsoft.com/office/word/2010/wordml" xmlns:w15="http://schemas.microsoft.com/office/word/2012/wordml" xmlns:w16se="http://schemas.microsoft.com/office/word/2015/wordml/symex" mc:Ignorable="w14 w15 w16se">
   <w:docDefaults>
     <w:rPrDefault>
       <w:rPr>
@@ -2228,7 +2309,7 @@
       </w:pPr>
     </w:pPrDefault>
   </w:docDefaults>
-  <w:latentStyles w:defLockedState="0" w:defUIPriority="99" w:defSemiHidden="0" w:defUnhideWhenUsed="0" w:defQFormat="0" w:count="376">
+  <w:latentStyles w:defLockedState="0" w:defUIPriority="99" w:defSemiHidden="0" w:defUnhideWhenUsed="0" w:defQFormat="0" w:count="371">
     <w:lsdException w:name="Normal" w:uiPriority="0" w:qFormat="1"/>
     <w:lsdException w:name="heading 1" w:uiPriority="9" w:qFormat="1"/>
     <w:lsdException w:name="heading 2" w:semiHidden="1" w:uiPriority="9" w:unhideWhenUsed="1" w:qFormat="1"/>
@@ -2600,11 +2681,6 @@
     <w:lsdException w:name="List Table 5 Dark Accent 6" w:uiPriority="50"/>
     <w:lsdException w:name="List Table 6 Colorful Accent 6" w:uiPriority="51"/>
     <w:lsdException w:name="List Table 7 Colorful Accent 6" w:uiPriority="52"/>
-    <w:lsdException w:name="Mention" w:semiHidden="1" w:unhideWhenUsed="1"/>
-    <w:lsdException w:name="Smart Hyperlink" w:semiHidden="1" w:unhideWhenUsed="1"/>
-    <w:lsdException w:name="Hashtag" w:semiHidden="1" w:unhideWhenUsed="1"/>
-    <w:lsdException w:name="Unresolved Mention" w:semiHidden="1" w:unhideWhenUsed="1"/>
-    <w:lsdException w:name="Smart Link" w:semiHidden="1" w:unhideWhenUsed="1"/>
   </w:latentStyles>
   <w:style w:type="paragraph" w:default="1" w:styleId="Normal">
     <w:name w:val="Normal"/>
@@ -2618,13 +2694,13 @@
       <w:lang w:eastAsia="es-EC"/>
     </w:rPr>
   </w:style>
-  <w:style w:type="character" w:default="1" w:styleId="DefaultParagraphFont">
+  <w:style w:type="character" w:default="1" w:styleId="Fuentedeprrafopredeter">
     <w:name w:val="Default Paragraph Font"/>
     <w:uiPriority w:val="1"/>
     <w:semiHidden/>
     <w:unhideWhenUsed/>
   </w:style>
-  <w:style w:type="table" w:default="1" w:styleId="TableNormal">
+  <w:style w:type="table" w:default="1" w:styleId="Tablanormal">
     <w:name w:val="Normal Table"/>
     <w:uiPriority w:val="99"/>
     <w:semiHidden/>
@@ -2639,16 +2715,16 @@
       </w:tblCellMar>
     </w:tblPr>
   </w:style>
-  <w:style w:type="numbering" w:default="1" w:styleId="NoList">
+  <w:style w:type="numbering" w:default="1" w:styleId="Sinlista">
     <w:name w:val="No List"/>
     <w:uiPriority w:val="99"/>
     <w:semiHidden/>
     <w:unhideWhenUsed/>
   </w:style>
-  <w:style w:type="paragraph" w:styleId="BalloonText">
+  <w:style w:type="paragraph" w:styleId="Textodeglobo">
     <w:name w:val="Balloon Text"/>
     <w:basedOn w:val="Normal"/>
-    <w:link w:val="BalloonTextChar"/>
+    <w:link w:val="TextodegloboCar"/>
     <w:uiPriority w:val="99"/>
     <w:semiHidden/>
     <w:unhideWhenUsed/>
@@ -2662,10 +2738,10 @@
       <w:szCs w:val="18"/>
     </w:rPr>
   </w:style>
-  <w:style w:type="character" w:customStyle="1" w:styleId="BalloonTextChar">
-    <w:name w:val="Balloon Text Char"/>
-    <w:basedOn w:val="DefaultParagraphFont"/>
-    <w:link w:val="BalloonText"/>
+  <w:style w:type="character" w:customStyle="1" w:styleId="TextodegloboCar">
+    <w:name w:val="Texto de globo Car"/>
+    <w:basedOn w:val="Fuentedeprrafopredeter"/>
+    <w:link w:val="Textodeglobo"/>
     <w:uiPriority w:val="99"/>
     <w:semiHidden/>
     <w:rsid w:val="00500A3C"/>
@@ -2691,17 +2767,17 @@
   </w:style>
   <w:style w:type="character" w:customStyle="1" w:styleId="normaltextrun">
     <w:name w:val="normaltextrun"/>
-    <w:basedOn w:val="DefaultParagraphFont"/>
+    <w:basedOn w:val="Fuentedeprrafopredeter"/>
     <w:rsid w:val="007A3FED"/>
   </w:style>
   <w:style w:type="character" w:customStyle="1" w:styleId="tabchar">
     <w:name w:val="tabchar"/>
-    <w:basedOn w:val="DefaultParagraphFont"/>
+    <w:basedOn w:val="Fuentedeprrafopredeter"/>
     <w:rsid w:val="007A3FED"/>
   </w:style>
   <w:style w:type="character" w:customStyle="1" w:styleId="eop">
     <w:name w:val="eop"/>
-    <w:basedOn w:val="DefaultParagraphFont"/>
+    <w:basedOn w:val="Fuentedeprrafopredeter"/>
     <w:rsid w:val="007A3FED"/>
   </w:style>
 </w:styles>
@@ -3179,20 +3255,20 @@
 </file>
 
 <file path=customXml/item2.xml><?xml version="1.0" encoding="utf-8"?>
-<p:properties xmlns:p="http://schemas.microsoft.com/office/2006/metadata/properties" xmlns:xsi="http://www.w3.org/2001/XMLSchema-instance" xmlns:pc="http://schemas.microsoft.com/office/infopath/2007/PartnerControls">
-  <documentManagement>
-    <_activity xmlns="d1568c05-ee6c-4002-8f27-7f3846215e8a" xsi:nil="true"/>
-  </documentManagement>
-</p:properties>
-</file>
-
-<file path=customXml/item3.xml><?xml version="1.0" encoding="utf-8"?>
 <?mso-contentType ?>
 <FormTemplates xmlns="http://schemas.microsoft.com/sharepoint/v3/contenttype/forms">
   <Display>DocumentLibraryForm</Display>
   <Edit>DocumentLibraryForm</Edit>
   <New>DocumentLibraryForm</New>
 </FormTemplates>
+</file>
+
+<file path=customXml/item3.xml><?xml version="1.0" encoding="utf-8"?>
+<p:properties xmlns:p="http://schemas.microsoft.com/office/2006/metadata/properties" xmlns:xsi="http://www.w3.org/2001/XMLSchema-instance" xmlns:pc="http://schemas.microsoft.com/office/infopath/2007/PartnerControls">
+  <documentManagement>
+    <_activity xmlns="d1568c05-ee6c-4002-8f27-7f3846215e8a" xsi:nil="true"/>
+  </documentManagement>
+</p:properties>
 </file>
 
 <file path=customXml/itemProps1.xml><?xml version="1.0" encoding="utf-8"?>
@@ -3214,6 +3290,14 @@
 </file>
 
 <file path=customXml/itemProps2.xml><?xml version="1.0" encoding="utf-8"?>
+<ds:datastoreItem xmlns:ds="http://schemas.openxmlformats.org/officeDocument/2006/customXml" ds:itemID="{836CEF3E-8D8F-4459-A64A-E4CF42A08AEF}">
+  <ds:schemaRefs>
+    <ds:schemaRef ds:uri="http://schemas.microsoft.com/sharepoint/v3/contenttype/forms"/>
+  </ds:schemaRefs>
+</ds:datastoreItem>
+</file>
+
+<file path=customXml/itemProps3.xml><?xml version="1.0" encoding="utf-8"?>
 <ds:datastoreItem xmlns:ds="http://schemas.openxmlformats.org/officeDocument/2006/customXml" ds:itemID="{ADD6E817-8A2F-4F1D-B3D7-60BDA760A97D}">
   <ds:schemaRefs>
     <ds:schemaRef ds:uri="http://schemas.microsoft.com/office/2006/metadata/properties"/>
@@ -3221,12 +3305,4 @@
     <ds:schemaRef ds:uri="d1568c05-ee6c-4002-8f27-7f3846215e8a"/>
   </ds:schemaRefs>
 </ds:datastoreItem>
-</file>
-
-<file path=customXml/itemProps3.xml><?xml version="1.0" encoding="utf-8"?>
-<ds:datastoreItem xmlns:ds="http://schemas.openxmlformats.org/officeDocument/2006/customXml" ds:itemID="{836CEF3E-8D8F-4459-A64A-E4CF42A08AEF}">
-  <ds:schemaRefs>
-    <ds:schemaRef ds:uri="http://schemas.microsoft.com/sharepoint/v3/contenttype/forms"/>
-  </ds:schemaRefs>
-</ds:datastoreItem>
 </file>
</xml_diff>